<commit_message>
Stable 2.7.2 Java "Cambios de Actas"
</commit_message>
<xml_diff>
--- a/backend/src/main/resources/plantillas/Acta de Entrega 2 2 - copia.docx
+++ b/backend/src/main/resources/plantillas/Acta de Entrega 2 2 - copia.docx
@@ -62,7 +62,7 @@
                 <v:shape id="_x0000_i1025" type="#_x0000_t75" style="width:2in;height:42pt" o:ole="">
                   <v:imagedata r:id="rId8" o:title=""/>
                 </v:shape>
-                <o:OLEObject Type="Embed" ProgID="PBrush" ShapeID="_x0000_i1025" DrawAspect="Content" ObjectID="_1846988437" r:id="rId9"/>
+                <o:OLEObject Type="Embed" ProgID="PBrush" ShapeID="_x0000_i1025" DrawAspect="Content" ObjectID="_1847250174" r:id="rId9"/>
               </w:object>
             </w:r>
           </w:p>
@@ -3122,7 +3122,7 @@
     </w:p>
     <w:tbl>
       <w:tblPr>
-        <w:tblpPr w:leftFromText="141" w:rightFromText="141" w:vertAnchor="text" w:horzAnchor="page" w:tblpX="4801" w:tblpY="416"/>
+        <w:tblpPr w:leftFromText="141" w:rightFromText="141" w:vertAnchor="text" w:horzAnchor="margin" w:tblpXSpec="right" w:tblpY="269"/>
         <w:tblW w:w="3285" w:type="dxa"/>
         <w:tblCellMar>
           <w:left w:w="0" w:type="dxa"/>
@@ -3137,13 +3137,7 @@
         <w:tc>
           <w:tcPr>
             <w:tcW w:w="3285" w:type="dxa"/>
-            <w:tcBorders>
-              <w:top w:val="single" w:sz="8" w:space="0" w:color="auto"/>
-              <w:left w:val="single" w:sz="8" w:space="0" w:color="auto"/>
-              <w:bottom w:val="single" w:sz="8" w:space="0" w:color="auto"/>
-              <w:right w:val="single" w:sz="8" w:space="0" w:color="auto"/>
-            </w:tcBorders>
-            <w:shd w:val="clear" w:color="auto" w:fill="F2F2F2"/>
+            <w:shd w:val="clear" w:color="auto" w:fill="FFFFFF" w:themeFill="background1"/>
             <w:tcMar>
               <w:top w:w="0" w:type="dxa"/>
               <w:left w:w="108" w:type="dxa"/>
@@ -3158,33 +3152,19 @@
               <w:jc w:val="center"/>
             </w:pPr>
             <w:bookmarkStart w:id="14" w:name="OLE_LINK20"/>
-            <w:bookmarkStart w:id="15" w:name="OLE_LINK17"/>
-            <w:r>
-              <w:rPr>
-                <w:rFonts w:ascii="Arial Narrow" w:hAnsi="Arial Narrow"/>
-                <w:b/>
-                <w:bCs/>
-                <w:color w:val="000000"/>
-                <w:sz w:val="22"/>
-                <w:szCs w:val="22"/>
-              </w:rPr>
-              <w:t>Entrega</w:t>
-            </w:r>
           </w:p>
         </w:tc>
       </w:tr>
       <w:tr>
         <w:trPr>
-          <w:trHeight w:val="1000"/>
+          <w:trHeight w:val="1135"/>
         </w:trPr>
         <w:tc>
           <w:tcPr>
             <w:tcW w:w="3285" w:type="dxa"/>
             <w:tcBorders>
               <w:top w:val="nil"/>
-              <w:left w:val="single" w:sz="8" w:space="0" w:color="auto"/>
-              <w:bottom w:val="single" w:sz="8" w:space="0" w:color="auto"/>
-              <w:right w:val="single" w:sz="8" w:space="0" w:color="auto"/>
+              <w:bottom w:val="single" w:sz="4" w:space="0" w:color="auto"/>
             </w:tcBorders>
             <w:tcMar>
               <w:top w:w="0" w:type="dxa"/>
@@ -3199,40 +3179,10 @@
             <w:pPr>
               <w:jc w:val="center"/>
               <w:rPr>
-                <w:rFonts w:ascii="Arial" w:hAnsi="Arial" w:cs="Arial"/>
+                <w:u w:val="single"/>
               </w:rPr>
             </w:pPr>
-            <w:r>
-              <w:rPr>
-                <w:rFonts w:ascii="Arial Narrow" w:hAnsi="Arial Narrow" w:cs="Arial"/>
-                <w:bCs/>
-                <w:sz w:val="22"/>
-                <w:szCs w:val="22"/>
-              </w:rPr>
-              <w:t>{{</w:t>
-            </w:r>
-            <w:proofErr w:type="spellStart"/>
-            <w:r>
-              <w:rPr>
-                <w:rFonts w:ascii="Arial Narrow" w:hAnsi="Arial Narrow" w:cs="Arial"/>
-                <w:bCs/>
-                <w:sz w:val="22"/>
-                <w:szCs w:val="22"/>
-              </w:rPr>
-              <w:t>firma_usuario</w:t>
-            </w:r>
-            <w:proofErr w:type="spellEnd"/>
-            <w:r>
-              <w:rPr>
-                <w:rFonts w:ascii="Arial Narrow" w:hAnsi="Arial Narrow" w:cs="Arial"/>
-                <w:bCs/>
-                <w:sz w:val="22"/>
-                <w:szCs w:val="22"/>
-              </w:rPr>
-              <w:t>}}</w:t>
-            </w:r>
           </w:p>
-          <w:p/>
         </w:tc>
       </w:tr>
       <w:tr>
@@ -3243,10 +3193,7 @@
           <w:tcPr>
             <w:tcW w:w="3285" w:type="dxa"/>
             <w:tcBorders>
-              <w:top w:val="nil"/>
-              <w:left w:val="single" w:sz="8" w:space="0" w:color="auto"/>
-              <w:bottom w:val="single" w:sz="8" w:space="0" w:color="auto"/>
-              <w:right w:val="single" w:sz="8" w:space="0" w:color="auto"/>
+              <w:top w:val="single" w:sz="4" w:space="0" w:color="auto"/>
             </w:tcBorders>
             <w:tcMar>
               <w:top w:w="0" w:type="dxa"/>
@@ -3298,12 +3245,6 @@
         <w:tc>
           <w:tcPr>
             <w:tcW w:w="3285" w:type="dxa"/>
-            <w:tcBorders>
-              <w:top w:val="nil"/>
-              <w:left w:val="single" w:sz="8" w:space="0" w:color="auto"/>
-              <w:bottom w:val="single" w:sz="8" w:space="0" w:color="auto"/>
-              <w:right w:val="single" w:sz="8" w:space="0" w:color="auto"/>
-            </w:tcBorders>
             <w:tcMar>
               <w:top w:w="0" w:type="dxa"/>
               <w:left w:w="108" w:type="dxa"/>
@@ -3313,7 +3254,6 @@
             <w:hideMark/>
           </w:tcPr>
           <w:p>
-            <w:bookmarkStart w:id="16" w:name="OLE_LINK15"/>
             <w:r>
               <w:rPr>
                 <w:rFonts w:ascii="Arial Narrow" w:hAnsi="Arial Narrow"/>
@@ -3330,18 +3270,29 @@
                 <w:szCs w:val="22"/>
                 <w:lang w:val="es-CO"/>
               </w:rPr>
-              <w:t xml:space="preserve"> {{</w:t>
-            </w:r>
-            <w:r>
-              <w:rPr>
-                <w:rFonts w:ascii="Arial Narrow" w:hAnsi="Arial Narrow" w:cs="Arial"/>
-                <w:bCs/>
-                <w:sz w:val="22"/>
-                <w:szCs w:val="22"/>
-                <w:lang w:val="es-CO"/>
-              </w:rPr>
               <w:t xml:space="preserve"> </w:t>
             </w:r>
+            <w:proofErr w:type="gramStart"/>
+            <w:r>
+              <w:rPr>
+                <w:rFonts w:ascii="Arial Narrow" w:hAnsi="Arial Narrow" w:cs="Arial"/>
+                <w:bCs/>
+                <w:sz w:val="22"/>
+                <w:szCs w:val="22"/>
+                <w:lang w:val="es-CO"/>
+              </w:rPr>
+              <w:t>{{</w:t>
+            </w:r>
+            <w:r>
+              <w:rPr>
+                <w:rFonts w:ascii="Arial Narrow" w:hAnsi="Arial Narrow" w:cs="Arial"/>
+                <w:bCs/>
+                <w:sz w:val="22"/>
+                <w:szCs w:val="22"/>
+                <w:lang w:val="es-CO"/>
+              </w:rPr>
+              <w:t xml:space="preserve"> </w:t>
+            </w:r>
             <w:proofErr w:type="spellStart"/>
             <w:r>
               <w:rPr>
@@ -3351,7 +3302,18 @@
                 <w:szCs w:val="22"/>
                 <w:lang w:val="es-CO"/>
               </w:rPr>
-              <w:t>cargo_recibe</w:t>
+              <w:t>cargo</w:t>
+            </w:r>
+            <w:proofErr w:type="gramEnd"/>
+            <w:r>
+              <w:rPr>
+                <w:rFonts w:ascii="Arial Narrow" w:hAnsi="Arial Narrow" w:cs="Arial"/>
+                <w:bCs/>
+                <w:sz w:val="22"/>
+                <w:szCs w:val="22"/>
+                <w:lang w:val="es-CO"/>
+              </w:rPr>
+              <w:t>_recibe</w:t>
             </w:r>
             <w:proofErr w:type="spellEnd"/>
             <w:r>
@@ -3370,7 +3332,7 @@
     </w:tbl>
     <w:tbl>
       <w:tblPr>
-        <w:tblpPr w:leftFromText="141" w:rightFromText="141" w:vertAnchor="text" w:horzAnchor="page" w:tblpX="8071" w:tblpY="416"/>
+        <w:tblpPr w:leftFromText="141" w:rightFromText="141" w:vertAnchor="text" w:horzAnchor="margin" w:tblpY="257"/>
         <w:tblW w:w="3285" w:type="dxa"/>
         <w:tblCellMar>
           <w:left w:w="0" w:type="dxa"/>
@@ -3382,16 +3344,16 @@
         <w:gridCol w:w="3285"/>
       </w:tblGrid>
       <w:tr>
+        <w:trPr>
+          <w:trHeight w:val="1135"/>
+        </w:trPr>
         <w:tc>
           <w:tcPr>
             <w:tcW w:w="3285" w:type="dxa"/>
             <w:tcBorders>
-              <w:top w:val="single" w:sz="8" w:space="0" w:color="auto"/>
-              <w:left w:val="single" w:sz="8" w:space="0" w:color="auto"/>
-              <w:bottom w:val="single" w:sz="8" w:space="0" w:color="auto"/>
-              <w:right w:val="single" w:sz="8" w:space="0" w:color="auto"/>
+              <w:bottom w:val="single" w:sz="4" w:space="0" w:color="auto"/>
             </w:tcBorders>
-            <w:shd w:val="clear" w:color="auto" w:fill="F2F2F2"/>
+            <w:shd w:val="clear" w:color="auto" w:fill="FFFFFF" w:themeFill="background1"/>
             <w:tcMar>
               <w:top w:w="0" w:type="dxa"/>
               <w:left w:w="108" w:type="dxa"/>
@@ -3402,99 +3364,26 @@
             <w:hideMark/>
           </w:tcPr>
           <w:p>
-            <w:pPr>
-              <w:jc w:val="center"/>
-              <w:rPr>
-                <w:u w:val="single"/>
-              </w:rPr>
-            </w:pPr>
-            <w:bookmarkStart w:id="17" w:name="OLE_LINK19"/>
-            <w:r>
-              <w:rPr>
-                <w:rFonts w:ascii="Arial Narrow" w:hAnsi="Arial Narrow"/>
-                <w:b/>
-                <w:bCs/>
-                <w:color w:val="000000"/>
-                <w:sz w:val="22"/>
-                <w:szCs w:val="22"/>
-              </w:rPr>
-              <w:t>Foto Usuario</w:t>
-            </w:r>
+            <w:bookmarkStart w:id="15" w:name="OLE_LINK18"/>
+            <w:bookmarkStart w:id="16" w:name="OLE_LINK17"/>
+            <w:bookmarkStart w:id="17" w:name="OLE_LINK15"/>
+            <w:bookmarkStart w:id="18" w:name="OLE_LINK16"/>
+            <w:bookmarkEnd w:id="14"/>
           </w:p>
         </w:tc>
       </w:tr>
+      <w:bookmarkEnd w:id="16"/>
+      <w:bookmarkEnd w:id="17"/>
+      <w:bookmarkEnd w:id="18"/>
       <w:tr>
         <w:trPr>
-          <w:trHeight w:val="1276"/>
+          <w:trHeight w:val="205"/>
         </w:trPr>
         <w:tc>
           <w:tcPr>
             <w:tcW w:w="3285" w:type="dxa"/>
             <w:tcBorders>
-              <w:top w:val="nil"/>
-              <w:left w:val="single" w:sz="8" w:space="0" w:color="auto"/>
-              <w:right w:val="single" w:sz="8" w:space="0" w:color="auto"/>
-            </w:tcBorders>
-            <w:tcMar>
-              <w:top w:w="0" w:type="dxa"/>
-              <w:left w:w="108" w:type="dxa"/>
-              <w:bottom w:w="0" w:type="dxa"/>
-              <w:right w:w="108" w:type="dxa"/>
-            </w:tcMar>
-            <w:vAlign w:val="center"/>
-            <w:hideMark/>
-          </w:tcPr>
-          <w:p>
-            <w:pPr>
-              <w:jc w:val="center"/>
-              <w:rPr>
-                <w:rFonts w:ascii="Arial" w:hAnsi="Arial" w:cs="Arial"/>
-                <w:u w:val="single"/>
-              </w:rPr>
-            </w:pPr>
-            <w:bookmarkStart w:id="18" w:name="OLE_LINK16"/>
-            <w:r>
-              <w:rPr>
-                <w:rFonts w:ascii="Arial Narrow" w:hAnsi="Arial Narrow" w:cs="Arial"/>
-                <w:bCs/>
-                <w:sz w:val="22"/>
-                <w:szCs w:val="22"/>
-              </w:rPr>
-              <w:t>{{</w:t>
-            </w:r>
-            <w:proofErr w:type="spellStart"/>
-            <w:r>
-              <w:rPr>
-                <w:rFonts w:ascii="Arial Narrow" w:hAnsi="Arial Narrow" w:cs="Arial"/>
-                <w:bCs/>
-                <w:sz w:val="22"/>
-                <w:szCs w:val="22"/>
-              </w:rPr>
-              <w:t>foto_usuario</w:t>
-            </w:r>
-            <w:proofErr w:type="spellEnd"/>
-            <w:r>
-              <w:rPr>
-                <w:rFonts w:ascii="Arial Narrow" w:hAnsi="Arial Narrow" w:cs="Arial"/>
-                <w:bCs/>
-                <w:sz w:val="22"/>
-                <w:szCs w:val="22"/>
-              </w:rPr>
-              <w:t>}}</w:t>
-            </w:r>
-          </w:p>
-          <w:p/>
-        </w:tc>
-      </w:tr>
-      <w:tr>
-        <w:tc>
-          <w:tcPr>
-            <w:tcW w:w="3285" w:type="dxa"/>
-            <w:tcBorders>
-              <w:top w:val="nil"/>
-              <w:left w:val="single" w:sz="8" w:space="0" w:color="auto"/>
-              <w:bottom w:val="single" w:sz="8" w:space="0" w:color="auto"/>
-              <w:right w:val="single" w:sz="8" w:space="0" w:color="auto"/>
+              <w:top w:val="single" w:sz="4" w:space="0" w:color="auto"/>
             </w:tcBorders>
             <w:tcMar>
               <w:top w:w="0" w:type="dxa"/>
@@ -3504,135 +3393,34 @@
             </w:tcMar>
             <w:vAlign w:val="center"/>
           </w:tcPr>
-          <w:p/>
-        </w:tc>
-      </w:tr>
-    </w:tbl>
-    <w:tbl>
-      <w:tblPr>
-        <w:tblpPr w:leftFromText="141" w:rightFromText="141" w:vertAnchor="text" w:horzAnchor="page" w:tblpX="1126" w:tblpY="401"/>
-        <w:tblW w:w="3285" w:type="dxa"/>
-        <w:tblCellMar>
-          <w:left w:w="0" w:type="dxa"/>
-          <w:right w:w="0" w:type="dxa"/>
-        </w:tblCellMar>
-        <w:tblLook w:val="04A0" w:firstRow="1" w:lastRow="0" w:firstColumn="1" w:lastColumn="0" w:noHBand="0" w:noVBand="1"/>
-      </w:tblPr>
-      <w:tblGrid>
-        <w:gridCol w:w="3285"/>
-      </w:tblGrid>
-      <w:tr>
-        <w:tc>
-          <w:tcPr>
-            <w:tcW w:w="3285" w:type="dxa"/>
-            <w:tcBorders>
-              <w:top w:val="single" w:sz="8" w:space="0" w:color="auto"/>
-              <w:left w:val="single" w:sz="8" w:space="0" w:color="auto"/>
-              <w:bottom w:val="single" w:sz="8" w:space="0" w:color="auto"/>
-              <w:right w:val="single" w:sz="8" w:space="0" w:color="auto"/>
-            </w:tcBorders>
-            <w:shd w:val="clear" w:color="auto" w:fill="F2F2F2"/>
-            <w:tcMar>
-              <w:top w:w="0" w:type="dxa"/>
-              <w:left w:w="108" w:type="dxa"/>
-              <w:bottom w:w="0" w:type="dxa"/>
-              <w:right w:w="108" w:type="dxa"/>
-            </w:tcMar>
-            <w:vAlign w:val="center"/>
-            <w:hideMark/>
-          </w:tcPr>
           <w:p>
             <w:pPr>
-              <w:jc w:val="center"/>
+              <w:rPr>
+                <w:rFonts w:ascii="Arial Narrow" w:hAnsi="Arial Narrow" w:cs="Arial"/>
+                <w:bCs/>
+                <w:sz w:val="22"/>
+                <w:szCs w:val="22"/>
+              </w:rPr>
             </w:pPr>
-            <w:bookmarkStart w:id="19" w:name="OLE_LINK18"/>
-            <w:bookmarkEnd w:id="14"/>
-            <w:bookmarkEnd w:id="17"/>
-            <w:r>
-              <w:rPr>
-                <w:rFonts w:ascii="Arial Narrow" w:hAnsi="Arial Narrow"/>
-                <w:b/>
-                <w:bCs/>
-                <w:color w:val="000000"/>
+            <w:r>
+              <w:rPr>
+                <w:rFonts w:ascii="Arial Narrow" w:hAnsi="Arial Narrow" w:cs="Arial"/>
+                <w:bCs/>
                 <w:sz w:val="22"/>
                 <w:szCs w:val="22"/>
               </w:rPr>
               <w:t>Dirección Infraestructura</w:t>
             </w:r>
-          </w:p>
-        </w:tc>
-      </w:tr>
-      <w:bookmarkEnd w:id="15"/>
-      <w:bookmarkEnd w:id="16"/>
-      <w:bookmarkEnd w:id="18"/>
-      <w:tr>
-        <w:trPr>
-          <w:trHeight w:val="1217"/>
-        </w:trPr>
-        <w:tc>
-          <w:tcPr>
-            <w:tcW w:w="3285" w:type="dxa"/>
-            <w:tcBorders>
-              <w:top w:val="nil"/>
-              <w:left w:val="single" w:sz="8" w:space="0" w:color="auto"/>
-              <w:right w:val="single" w:sz="8" w:space="0" w:color="auto"/>
-            </w:tcBorders>
-            <w:tcMar>
-              <w:top w:w="0" w:type="dxa"/>
-              <w:left w:w="108" w:type="dxa"/>
-              <w:bottom w:w="0" w:type="dxa"/>
-              <w:right w:w="108" w:type="dxa"/>
-            </w:tcMar>
-            <w:vAlign w:val="center"/>
-            <w:hideMark/>
-          </w:tcPr>
-          <w:p>
-            <w:pPr>
-              <w:rPr>
-                <w:rFonts w:ascii="Arial" w:hAnsi="Arial" w:cs="Arial"/>
-              </w:rPr>
-            </w:pPr>
-            <w:r>
-              <w:rPr>
-                <w:rFonts w:ascii="Arial Narrow" w:hAnsi="Arial Narrow" w:cs="Arial"/>
-                <w:bCs/>
-                <w:sz w:val="22"/>
-                <w:szCs w:val="22"/>
-              </w:rPr>
-              <w:t xml:space="preserve">         </w:t>
-            </w:r>
-            <w:r>
-              <w:rPr>
-                <w:rFonts w:ascii="Arial Narrow" w:hAnsi="Arial Narrow" w:cs="Arial"/>
-                <w:bCs/>
-                <w:sz w:val="22"/>
-                <w:szCs w:val="22"/>
-              </w:rPr>
-              <w:t xml:space="preserve">      </w:t>
-            </w:r>
-          </w:p>
-          <w:p>
-            <w:pPr>
-              <w:rPr>
-                <w:u w:val="single"/>
-              </w:rPr>
-            </w:pPr>
           </w:p>
         </w:tc>
       </w:tr>
       <w:tr>
         <w:trPr>
-          <w:trHeight w:val="323"/>
+          <w:trHeight w:val="223"/>
         </w:trPr>
         <w:tc>
           <w:tcPr>
             <w:tcW w:w="3285" w:type="dxa"/>
-            <w:tcBorders>
-              <w:top w:val="nil"/>
-              <w:left w:val="single" w:sz="8" w:space="0" w:color="auto"/>
-              <w:bottom w:val="single" w:sz="8" w:space="0" w:color="auto"/>
-              <w:right w:val="single" w:sz="8" w:space="0" w:color="auto"/>
-            </w:tcBorders>
             <w:tcMar>
               <w:top w:w="0" w:type="dxa"/>
               <w:left w:w="108" w:type="dxa"/>
@@ -3644,7 +3432,7 @@
           <w:p/>
         </w:tc>
       </w:tr>
-      <w:bookmarkEnd w:id="19"/>
+      <w:bookmarkEnd w:id="15"/>
     </w:tbl>
     <w:p>
       <w:pPr>

</xml_diff>

<commit_message>
Stable 3.2 Java "Arreglos menores actas"
</commit_message>
<xml_diff>
--- a/backend/src/main/resources/plantillas/Acta de Entrega 2 2 - copia.docx
+++ b/backend/src/main/resources/plantillas/Acta de Entrega 2 2 - copia.docx
@@ -62,7 +62,7 @@
                 <v:shape id="_x0000_i1025" type="#_x0000_t75" style="width:2in;height:42pt" o:ole="">
                   <v:imagedata r:id="rId8" o:title=""/>
                 </v:shape>
-                <o:OLEObject Type="Embed" ProgID="PBrush" ShapeID="_x0000_i1025" DrawAspect="Content" ObjectID="_1847250174" r:id="rId9"/>
+                <o:OLEObject Type="Embed" ProgID="PBrush" ShapeID="_x0000_i1025" DrawAspect="Content" ObjectID="_1847349171" r:id="rId9"/>
               </w:object>
             </w:r>
           </w:p>
@@ -3207,6 +3207,8 @@
             <w:r>
               <w:rPr>
                 <w:rFonts w:ascii="Arial Narrow" w:hAnsi="Arial Narrow" w:cs="Arial"/>
+                <w:b/>
+                <w:bCs/>
                 <w:sz w:val="22"/>
                 <w:szCs w:val="22"/>
               </w:rPr>
@@ -3215,10 +3217,20 @@
             <w:r>
               <w:rPr>
                 <w:rFonts w:ascii="Arial Narrow" w:hAnsi="Arial Narrow"/>
-                <w:sz w:val="22"/>
-                <w:szCs w:val="22"/>
-              </w:rPr>
-              <w:t>: {{</w:t>
+                <w:b/>
+                <w:bCs/>
+                <w:sz w:val="22"/>
+                <w:szCs w:val="22"/>
+              </w:rPr>
+              <w:t>:</w:t>
+            </w:r>
+            <w:r>
+              <w:rPr>
+                <w:rFonts w:ascii="Arial Narrow" w:hAnsi="Arial Narrow"/>
+                <w:sz w:val="22"/>
+                <w:szCs w:val="22"/>
+              </w:rPr>
+              <w:t xml:space="preserve"> {{</w:t>
             </w:r>
             <w:proofErr w:type="spellStart"/>
             <w:r>
@@ -3257,6 +3269,8 @@
             <w:r>
               <w:rPr>
                 <w:rFonts w:ascii="Arial Narrow" w:hAnsi="Arial Narrow"/>
+                <w:b/>
+                <w:bCs/>
                 <w:sz w:val="22"/>
                 <w:szCs w:val="22"/>
               </w:rPr>
@@ -3364,17 +3378,17 @@
             <w:hideMark/>
           </w:tcPr>
           <w:p>
-            <w:bookmarkStart w:id="15" w:name="OLE_LINK18"/>
-            <w:bookmarkStart w:id="16" w:name="OLE_LINK17"/>
-            <w:bookmarkStart w:id="17" w:name="OLE_LINK15"/>
-            <w:bookmarkStart w:id="18" w:name="OLE_LINK16"/>
+            <w:bookmarkStart w:id="15" w:name="OLE_LINK17"/>
+            <w:bookmarkStart w:id="16" w:name="OLE_LINK15"/>
+            <w:bookmarkStart w:id="17" w:name="OLE_LINK16"/>
+            <w:bookmarkStart w:id="18" w:name="OLE_LINK18"/>
             <w:bookmarkEnd w:id="14"/>
           </w:p>
         </w:tc>
       </w:tr>
+      <w:bookmarkEnd w:id="15"/>
       <w:bookmarkEnd w:id="16"/>
       <w:bookmarkEnd w:id="17"/>
-      <w:bookmarkEnd w:id="18"/>
       <w:tr>
         <w:trPr>
           <w:trHeight w:val="205"/>
@@ -3397,7 +3411,7 @@
             <w:pPr>
               <w:rPr>
                 <w:rFonts w:ascii="Arial Narrow" w:hAnsi="Arial Narrow" w:cs="Arial"/>
-                <w:bCs/>
+                <w:b/>
                 <w:sz w:val="22"/>
                 <w:szCs w:val="22"/>
               </w:rPr>
@@ -3405,7 +3419,7 @@
             <w:r>
               <w:rPr>
                 <w:rFonts w:ascii="Arial Narrow" w:hAnsi="Arial Narrow" w:cs="Arial"/>
-                <w:bCs/>
+                <w:b/>
                 <w:sz w:val="22"/>
                 <w:szCs w:val="22"/>
               </w:rPr>
@@ -3432,7 +3446,7 @@
           <w:p/>
         </w:tc>
       </w:tr>
-      <w:bookmarkEnd w:id="15"/>
+      <w:bookmarkEnd w:id="18"/>
     </w:tbl>
     <w:p>
       <w:pPr>

</xml_diff>